<commit_message>
Update project documentation with corrected ficha number and enhanced implementation manuals
</commit_message>
<xml_diff>
--- a/01-Especificacion de requisitos/SRS SGH (Sistema De Gestion De Horarios).docx
+++ b/01-Especificacion de requisitos/SRS SGH (Sistema De Gestion De Horarios).docx
@@ -5,6 +5,7 @@
     <w:p>
       <w:pPr>
         <w:pStyle w:val="Textoindependiente"/>
+        <w:ind w:left="708" w:hanging="708"/>
         <w:rPr>
           <w:rFonts w:ascii="Arial" w:eastAsia="Arial" w:hAnsi="Arial" w:cs="Arial"/>
           <w:sz w:val="20"/>
@@ -219,7 +220,7 @@
               </wp:inline>
             </w:drawing>
           </mc:Choice>
-          <mc:Fallback xmlns:a="http://schemas.openxmlformats.org/drawingml/2006/main" xmlns:pic="http://schemas.openxmlformats.org/drawingml/2006/picture" xmlns:a14="http://schemas.microsoft.com/office/drawing/2010/main" xmlns:w16sdtfl="http://schemas.microsoft.com/office/word/2024/wordml/sdtformatlock" xmlns:w16du="http://schemas.microsoft.com/office/word/2023/wordml/word16du" xmlns:oel="http://schemas.microsoft.com/office/2019/extlst">
+          <mc:Fallback xmlns:oel="http://schemas.microsoft.com/office/2019/extlst" xmlns:w16du="http://schemas.microsoft.com/office/word/2023/wordml/word16du" xmlns:w16sdtfl="http://schemas.microsoft.com/office/word/2024/wordml/sdtformatlock" xmlns:a14="http://schemas.microsoft.com/office/drawing/2010/main" xmlns:pic="http://schemas.openxmlformats.org/drawingml/2006/picture" xmlns:a="http://schemas.openxmlformats.org/drawingml/2006/main">
             <w:pict w14:anchorId="6945E18F">
               <v:group id="Group 1" style="width:281.25pt;height:.5pt;mso-position-horizontal-relative:char;mso-position-vertical-relative:line" coordsize="35718,63" o:spid="_x0000_s1026" w14:anchorId="70FE2A08" o:gfxdata="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">
                 <v:shape id="Graphic 2" style="position:absolute;width:35718;height:63;visibility:visible;mso-wrap-style:square;v-text-anchor:top" coordsize="3571875,6350" o:spid="_x0000_s1027" fillcolor="#292929" stroked="f" path="m3571366,l,,,6096r3571366,l3571366,xe" o:gfxdata="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">
@@ -640,7 +641,7 @@
               </wp:anchor>
             </w:drawing>
           </mc:Choice>
-          <mc:Fallback xmlns:a="http://schemas.openxmlformats.org/drawingml/2006/main" xmlns:pic="http://schemas.openxmlformats.org/drawingml/2006/picture" xmlns:a14="http://schemas.microsoft.com/office/drawing/2010/main" xmlns:w16sdtfl="http://schemas.microsoft.com/office/word/2024/wordml/sdtformatlock" xmlns:w16du="http://schemas.microsoft.com/office/word/2023/wordml/word16du" xmlns:oel="http://schemas.microsoft.com/office/2019/extlst">
+          <mc:Fallback xmlns:oel="http://schemas.microsoft.com/office/2019/extlst" xmlns:w16du="http://schemas.microsoft.com/office/word/2023/wordml/word16du" xmlns:w16sdtfl="http://schemas.microsoft.com/office/word/2024/wordml/sdtformatlock" xmlns:a14="http://schemas.microsoft.com/office/drawing/2010/main" xmlns:pic="http://schemas.openxmlformats.org/drawingml/2006/picture" xmlns:a="http://schemas.openxmlformats.org/drawingml/2006/main">
             <w:pict w14:anchorId="725B3D00">
               <v:shape id="Graphic 4" style="position:absolute;margin-left:220.15pt;margin-top:23.05pt;width:290.2pt;height:.5pt;z-index:-251657216;visibility:visible;mso-wrap-style:square;mso-wrap-distance-left:0;mso-wrap-distance-top:0;mso-wrap-distance-right:0;mso-wrap-distance-bottom:0;mso-position-horizontal:absolute;mso-position-horizontal-relative:page;mso-position-vertical:absolute;mso-position-vertical-relative:text;v-text-anchor:top" coordsize="3685540,6350" o:spid="_x0000_s1026" fillcolor="#292929" stroked="f" path="m1832089,r,l,,,6083r1832089,l1832089,xem3685540,l1832102,r,6083l3685540,6083r,-6083xe" o:gfxdata="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" w14:anchorId="306AD8E8">
                 <v:path arrowok="t"/>
@@ -1046,7 +1047,6 @@
               </w:rPr>
               <w:t xml:space="preserve"> </w:t>
             </w:r>
-            <w:proofErr w:type="spellStart"/>
             <w:r>
               <w:rPr>
                 <w:rFonts w:ascii="Arial" w:eastAsia="Arial" w:hAnsi="Arial" w:cs="Arial"/>
@@ -1054,17 +1054,7 @@
                 <w:bCs/>
                 <w:spacing w:val="-4"/>
               </w:rPr>
-              <w:t>dep</w:t>
-            </w:r>
-            <w:proofErr w:type="spellEnd"/>
-            <w:r>
-              <w:rPr>
-                <w:rFonts w:ascii="Arial" w:eastAsia="Arial" w:hAnsi="Arial" w:cs="Arial"/>
-                <w:b/>
-                <w:bCs/>
-                <w:spacing w:val="-4"/>
-              </w:rPr>
-              <w:t>.</w:t>
+              <w:t>dep.</w:t>
             </w:r>
           </w:p>
           <w:p>
@@ -3919,7 +3909,19 @@
         <w:rPr>
           <w:rFonts w:ascii="Arial" w:eastAsia="Arial" w:hAnsi="Arial" w:cs="Arial"/>
         </w:rPr>
-        <w:t>830, software que será el proyecto formativo de la ficha ADSO No.2899747.</w:t>
+        <w:t>830, software que será el proyecto formativo de la ficha ADSO No.2</w:t>
+      </w:r>
+      <w:r>
+        <w:rPr>
+          <w:rFonts w:ascii="Arial" w:eastAsia="Arial" w:hAnsi="Arial" w:cs="Arial"/>
+        </w:rPr>
+        <w:t>900177</w:t>
+      </w:r>
+      <w:r>
+        <w:rPr>
+          <w:rFonts w:ascii="Arial" w:eastAsia="Arial" w:hAnsi="Arial" w:cs="Arial"/>
+        </w:rPr>
+        <w:t>.</w:t>
       </w:r>
     </w:p>
     <w:p>
@@ -7922,17 +7924,8 @@
           <w:rFonts w:ascii="Arial" w:eastAsia="Arial" w:hAnsi="Arial" w:cs="Arial"/>
           <w:color w:val="434343"/>
         </w:rPr>
-        <w:t xml:space="preserve"> </w:t>
-      </w:r>
-      <w:proofErr w:type="spellStart"/>
-      <w:r>
-        <w:rPr>
-          <w:rFonts w:ascii="Arial" w:eastAsia="Arial" w:hAnsi="Arial" w:cs="Arial"/>
-          <w:color w:val="434343"/>
-        </w:rPr>
-        <w:t>frameworks</w:t>
-      </w:r>
-      <w:proofErr w:type="spellEnd"/>
+        <w:t xml:space="preserve"> frameworks</w:t>
+      </w:r>
       <w:r>
         <w:rPr>
           <w:rFonts w:ascii="Arial" w:eastAsia="Arial" w:hAnsi="Arial" w:cs="Arial"/>
@@ -11454,7 +11447,6 @@
             <w:r>
               <w:br/>
             </w:r>
-            <w:proofErr w:type="spellStart"/>
             <w:r>
               <w:rPr>
                 <w:rFonts w:ascii="Arial" w:eastAsia="Arial" w:hAnsi="Arial" w:cs="Arial"/>
@@ -11465,7 +11457,6 @@
               </w:rPr>
               <w:t>Visualizacion</w:t>
             </w:r>
-            <w:proofErr w:type="spellEnd"/>
             <w:r>
               <w:rPr>
                 <w:rFonts w:ascii="Arial" w:eastAsia="Arial" w:hAnsi="Arial" w:cs="Arial"/>
@@ -13593,33 +13584,8 @@
                 <w:rFonts w:ascii="Arial" w:eastAsia="Arial" w:hAnsi="Arial" w:cs="Arial"/>
                 <w:lang w:eastAsia="es-CO"/>
               </w:rPr>
-              <w:t xml:space="preserve">400 </w:t>
-            </w:r>
-            <w:proofErr w:type="spellStart"/>
-            <w:r>
-              <w:rPr>
-                <w:rFonts w:ascii="Arial" w:eastAsia="Arial" w:hAnsi="Arial" w:cs="Arial"/>
-                <w:lang w:eastAsia="es-CO"/>
-              </w:rPr>
-              <w:t>bad</w:t>
-            </w:r>
-            <w:proofErr w:type="spellEnd"/>
-            <w:r>
-              <w:rPr>
-                <w:rFonts w:ascii="Arial" w:eastAsia="Arial" w:hAnsi="Arial" w:cs="Arial"/>
-                <w:lang w:eastAsia="es-CO"/>
-              </w:rPr>
-              <w:t xml:space="preserve"> </w:t>
-            </w:r>
-            <w:proofErr w:type="spellStart"/>
-            <w:r>
-              <w:rPr>
-                <w:rFonts w:ascii="Arial" w:eastAsia="Arial" w:hAnsi="Arial" w:cs="Arial"/>
-                <w:lang w:eastAsia="es-CO"/>
-              </w:rPr>
-              <w:t>request</w:t>
-            </w:r>
-            <w:proofErr w:type="spellEnd"/>
+              <w:t>400 bad request</w:t>
+            </w:r>
             <w:r>
               <w:rPr>
                 <w:rFonts w:ascii="Arial" w:eastAsia="Arial" w:hAnsi="Arial" w:cs="Arial"/>
@@ -13650,33 +13616,8 @@
                 <w:rFonts w:ascii="Arial" w:eastAsia="Arial" w:hAnsi="Arial" w:cs="Arial"/>
                 <w:lang w:eastAsia="es-CO"/>
               </w:rPr>
-              <w:t xml:space="preserve">409 </w:t>
-            </w:r>
-            <w:proofErr w:type="spellStart"/>
-            <w:r>
-              <w:rPr>
-                <w:rFonts w:ascii="Arial" w:eastAsia="Arial" w:hAnsi="Arial" w:cs="Arial"/>
-                <w:lang w:eastAsia="es-CO"/>
-              </w:rPr>
-              <w:t>Conflict</w:t>
-            </w:r>
-            <w:proofErr w:type="spellEnd"/>
-            <w:r>
-              <w:rPr>
-                <w:rFonts w:ascii="Arial" w:eastAsia="Arial" w:hAnsi="Arial" w:cs="Arial"/>
-                <w:lang w:eastAsia="es-CO"/>
-              </w:rPr>
-              <w:t xml:space="preserve"> </w:t>
-            </w:r>
-            <w:proofErr w:type="spellStart"/>
-            <w:r>
-              <w:rPr>
-                <w:rFonts w:ascii="Arial" w:eastAsia="Arial" w:hAnsi="Arial" w:cs="Arial"/>
-                <w:lang w:eastAsia="es-CO"/>
-              </w:rPr>
-              <w:t>Json</w:t>
-            </w:r>
-            <w:proofErr w:type="spellEnd"/>
+              <w:t>409 Conflict Json</w:t>
+            </w:r>
           </w:p>
         </w:tc>
       </w:tr>
@@ -13858,7 +13799,6 @@
                 <w:lang w:eastAsia="es-CO"/>
               </w:rPr>
             </w:pPr>
-            <w:proofErr w:type="spellStart"/>
             <w:r>
               <w:rPr>
                 <w:rFonts w:ascii="Arial" w:eastAsia="Arial" w:hAnsi="Arial" w:cs="Arial"/>
@@ -13866,57 +13806,7 @@
                 <w:szCs w:val="18"/>
                 <w:lang w:eastAsia="es-CO"/>
               </w:rPr>
-              <w:t>Respond</w:t>
-            </w:r>
-            <w:proofErr w:type="spellEnd"/>
-            <w:r>
-              <w:rPr>
-                <w:rFonts w:ascii="Arial" w:eastAsia="Arial" w:hAnsi="Arial" w:cs="Arial"/>
-                <w:sz w:val="18"/>
-                <w:szCs w:val="18"/>
-                <w:lang w:eastAsia="es-CO"/>
-              </w:rPr>
-              <w:t xml:space="preserve"> 400 </w:t>
-            </w:r>
-            <w:proofErr w:type="spellStart"/>
-            <w:r>
-              <w:rPr>
-                <w:rFonts w:ascii="Arial" w:eastAsia="Arial" w:hAnsi="Arial" w:cs="Arial"/>
-                <w:sz w:val="18"/>
-                <w:szCs w:val="18"/>
-                <w:lang w:eastAsia="es-CO"/>
-              </w:rPr>
-              <w:t>bad</w:t>
-            </w:r>
-            <w:proofErr w:type="spellEnd"/>
-            <w:r>
-              <w:rPr>
-                <w:rFonts w:ascii="Arial" w:eastAsia="Arial" w:hAnsi="Arial" w:cs="Arial"/>
-                <w:sz w:val="18"/>
-                <w:szCs w:val="18"/>
-                <w:lang w:eastAsia="es-CO"/>
-              </w:rPr>
-              <w:t xml:space="preserve"> </w:t>
-            </w:r>
-            <w:proofErr w:type="spellStart"/>
-            <w:r>
-              <w:rPr>
-                <w:rFonts w:ascii="Arial" w:eastAsia="Arial" w:hAnsi="Arial" w:cs="Arial"/>
-                <w:sz w:val="18"/>
-                <w:szCs w:val="18"/>
-                <w:lang w:eastAsia="es-CO"/>
-              </w:rPr>
-              <w:t>request</w:t>
-            </w:r>
-            <w:proofErr w:type="spellEnd"/>
-            <w:r>
-              <w:rPr>
-                <w:rFonts w:ascii="Arial" w:eastAsia="Arial" w:hAnsi="Arial" w:cs="Arial"/>
-                <w:sz w:val="18"/>
-                <w:szCs w:val="18"/>
-                <w:lang w:eastAsia="es-CO"/>
-              </w:rPr>
-              <w:t>.</w:t>
+              <w:t>Respond 400 bad request.</w:t>
             </w:r>
           </w:p>
         </w:tc>
@@ -15027,7 +14917,6 @@
                 <w:lang w:eastAsia="es-ES"/>
               </w:rPr>
             </w:pPr>
-            <w:proofErr w:type="spellStart"/>
             <w:r>
               <w:rPr>
                 <w:rFonts w:ascii="Arial" w:eastAsia="Arial" w:hAnsi="Arial" w:cs="Arial"/>
@@ -15055,7 +14944,6 @@
               </w:rPr>
               <w:t>d</w:t>
             </w:r>
-            <w:proofErr w:type="spellEnd"/>
             <w:r>
               <w:rPr>
                 <w:rFonts w:ascii="Arial" w:eastAsia="Arial" w:hAnsi="Arial" w:cs="Arial"/>
@@ -15072,39 +14960,8 @@
                 <w:szCs w:val="18"/>
                 <w:lang w:eastAsia="es-ES"/>
               </w:rPr>
-              <w:t xml:space="preserve">400 </w:t>
-            </w:r>
-            <w:proofErr w:type="spellStart"/>
-            <w:r>
-              <w:rPr>
-                <w:rFonts w:ascii="Arial" w:eastAsia="Arial" w:hAnsi="Arial" w:cs="Arial"/>
-                <w:sz w:val="18"/>
-                <w:szCs w:val="18"/>
-                <w:lang w:eastAsia="es-ES"/>
-              </w:rPr>
-              <w:t>bad</w:t>
-            </w:r>
-            <w:proofErr w:type="spellEnd"/>
-            <w:r>
-              <w:rPr>
-                <w:rFonts w:ascii="Arial" w:eastAsia="Arial" w:hAnsi="Arial" w:cs="Arial"/>
-                <w:sz w:val="18"/>
-                <w:szCs w:val="18"/>
-                <w:lang w:eastAsia="es-ES"/>
-              </w:rPr>
-              <w:t xml:space="preserve"> </w:t>
-            </w:r>
-            <w:proofErr w:type="spellStart"/>
-            <w:r>
-              <w:rPr>
-                <w:rFonts w:ascii="Arial" w:eastAsia="Arial" w:hAnsi="Arial" w:cs="Arial"/>
-                <w:sz w:val="18"/>
-                <w:szCs w:val="18"/>
-                <w:lang w:eastAsia="es-ES"/>
-              </w:rPr>
-              <w:t>request</w:t>
-            </w:r>
-            <w:proofErr w:type="spellEnd"/>
+              <w:t>400 bad request</w:t>
+            </w:r>
             <w:r>
               <w:rPr>
                 <w:rFonts w:ascii="Arial" w:eastAsia="Arial" w:hAnsi="Arial" w:cs="Arial"/>
@@ -16204,65 +16061,14 @@
                 <w:lang w:eastAsia="es-ES"/>
               </w:rPr>
             </w:pPr>
-            <w:proofErr w:type="spellStart"/>
-            <w:r>
-              <w:rPr>
-                <w:rFonts w:ascii="Arial" w:eastAsia="Arial" w:hAnsi="Arial" w:cs="Arial"/>
-                <w:sz w:val="18"/>
-                <w:szCs w:val="18"/>
-                <w:lang w:eastAsia="es-ES"/>
-              </w:rPr>
-              <w:t>Respond</w:t>
-            </w:r>
-            <w:proofErr w:type="spellEnd"/>
-            <w:r>
-              <w:rPr>
-                <w:rFonts w:ascii="Arial" w:eastAsia="Arial" w:hAnsi="Arial" w:cs="Arial"/>
-                <w:sz w:val="18"/>
-                <w:szCs w:val="18"/>
-                <w:lang w:eastAsia="es-ES"/>
-              </w:rPr>
-              <w:t xml:space="preserve"> 400 </w:t>
-            </w:r>
-            <w:proofErr w:type="spellStart"/>
-            <w:r>
-              <w:rPr>
-                <w:rFonts w:ascii="Arial" w:eastAsia="Arial" w:hAnsi="Arial" w:cs="Arial"/>
-                <w:sz w:val="18"/>
-                <w:szCs w:val="18"/>
-                <w:lang w:eastAsia="es-ES"/>
-              </w:rPr>
-              <w:t>bad</w:t>
-            </w:r>
-            <w:proofErr w:type="spellEnd"/>
-            <w:r>
-              <w:rPr>
-                <w:rFonts w:ascii="Arial" w:eastAsia="Arial" w:hAnsi="Arial" w:cs="Arial"/>
-                <w:sz w:val="18"/>
-                <w:szCs w:val="18"/>
-                <w:lang w:eastAsia="es-ES"/>
-              </w:rPr>
-              <w:t xml:space="preserve"> </w:t>
-            </w:r>
-            <w:proofErr w:type="spellStart"/>
-            <w:r>
-              <w:rPr>
-                <w:rFonts w:ascii="Arial" w:eastAsia="Arial" w:hAnsi="Arial" w:cs="Arial"/>
-                <w:sz w:val="18"/>
-                <w:szCs w:val="18"/>
-                <w:lang w:eastAsia="es-ES"/>
-              </w:rPr>
-              <w:t>request</w:t>
-            </w:r>
-            <w:proofErr w:type="spellEnd"/>
-            <w:r>
-              <w:rPr>
-                <w:rFonts w:ascii="Arial" w:eastAsia="Arial" w:hAnsi="Arial" w:cs="Arial"/>
-                <w:sz w:val="18"/>
-                <w:szCs w:val="18"/>
-                <w:lang w:eastAsia="es-ES"/>
-              </w:rPr>
-              <w:t>.</w:t>
+            <w:r>
+              <w:rPr>
+                <w:rFonts w:ascii="Arial" w:eastAsia="Arial" w:hAnsi="Arial" w:cs="Arial"/>
+                <w:sz w:val="18"/>
+                <w:szCs w:val="18"/>
+                <w:lang w:eastAsia="es-ES"/>
+              </w:rPr>
+              <w:t>Respond 400 bad request.</w:t>
             </w:r>
           </w:p>
         </w:tc>
@@ -17521,65 +17327,14 @@
                 <w:lang w:eastAsia="es-ES"/>
               </w:rPr>
             </w:pPr>
-            <w:proofErr w:type="spellStart"/>
-            <w:r>
-              <w:rPr>
-                <w:rFonts w:ascii="Arial" w:eastAsia="Arial" w:hAnsi="Arial" w:cs="Arial"/>
-                <w:sz w:val="18"/>
-                <w:szCs w:val="18"/>
-                <w:lang w:eastAsia="es-ES"/>
-              </w:rPr>
-              <w:t>Respond</w:t>
-            </w:r>
-            <w:proofErr w:type="spellEnd"/>
-            <w:r>
-              <w:rPr>
-                <w:rFonts w:ascii="Arial" w:eastAsia="Arial" w:hAnsi="Arial" w:cs="Arial"/>
-                <w:sz w:val="18"/>
-                <w:szCs w:val="18"/>
-                <w:lang w:eastAsia="es-ES"/>
-              </w:rPr>
-              <w:t xml:space="preserve"> 400 </w:t>
-            </w:r>
-            <w:proofErr w:type="spellStart"/>
-            <w:r>
-              <w:rPr>
-                <w:rFonts w:ascii="Arial" w:eastAsia="Arial" w:hAnsi="Arial" w:cs="Arial"/>
-                <w:sz w:val="18"/>
-                <w:szCs w:val="18"/>
-                <w:lang w:eastAsia="es-ES"/>
-              </w:rPr>
-              <w:t>bad</w:t>
-            </w:r>
-            <w:proofErr w:type="spellEnd"/>
-            <w:r>
-              <w:rPr>
-                <w:rFonts w:ascii="Arial" w:eastAsia="Arial" w:hAnsi="Arial" w:cs="Arial"/>
-                <w:sz w:val="18"/>
-                <w:szCs w:val="18"/>
-                <w:lang w:eastAsia="es-ES"/>
-              </w:rPr>
-              <w:t xml:space="preserve"> </w:t>
-            </w:r>
-            <w:proofErr w:type="spellStart"/>
-            <w:r>
-              <w:rPr>
-                <w:rFonts w:ascii="Arial" w:eastAsia="Arial" w:hAnsi="Arial" w:cs="Arial"/>
-                <w:sz w:val="18"/>
-                <w:szCs w:val="18"/>
-                <w:lang w:eastAsia="es-ES"/>
-              </w:rPr>
-              <w:t>request</w:t>
-            </w:r>
-            <w:proofErr w:type="spellEnd"/>
-            <w:r>
-              <w:rPr>
-                <w:rFonts w:ascii="Arial" w:eastAsia="Arial" w:hAnsi="Arial" w:cs="Arial"/>
-                <w:sz w:val="18"/>
-                <w:szCs w:val="18"/>
-                <w:lang w:eastAsia="es-ES"/>
-              </w:rPr>
-              <w:t>.</w:t>
+            <w:r>
+              <w:rPr>
+                <w:rFonts w:ascii="Arial" w:eastAsia="Arial" w:hAnsi="Arial" w:cs="Arial"/>
+                <w:sz w:val="18"/>
+                <w:szCs w:val="18"/>
+                <w:lang w:eastAsia="es-ES"/>
+              </w:rPr>
+              <w:t>Respond 400 bad request.</w:t>
             </w:r>
           </w:p>
         </w:tc>
@@ -18492,47 +18247,7 @@
                 <w:szCs w:val="18"/>
                 <w:lang w:eastAsia="es-ES"/>
               </w:rPr>
-              <w:t xml:space="preserve">400 </w:t>
-            </w:r>
-            <w:proofErr w:type="spellStart"/>
-            <w:r>
-              <w:rPr>
-                <w:rFonts w:ascii="Arial" w:eastAsia="Arial" w:hAnsi="Arial" w:cs="Arial"/>
-                <w:sz w:val="18"/>
-                <w:szCs w:val="18"/>
-                <w:lang w:eastAsia="es-ES"/>
-              </w:rPr>
-              <w:t>bad</w:t>
-            </w:r>
-            <w:proofErr w:type="spellEnd"/>
-            <w:r>
-              <w:rPr>
-                <w:rFonts w:ascii="Arial" w:eastAsia="Arial" w:hAnsi="Arial" w:cs="Arial"/>
-                <w:sz w:val="18"/>
-                <w:szCs w:val="18"/>
-                <w:lang w:eastAsia="es-ES"/>
-              </w:rPr>
-              <w:t xml:space="preserve"> </w:t>
-            </w:r>
-            <w:proofErr w:type="spellStart"/>
-            <w:r>
-              <w:rPr>
-                <w:rFonts w:ascii="Arial" w:eastAsia="Arial" w:hAnsi="Arial" w:cs="Arial"/>
-                <w:sz w:val="18"/>
-                <w:szCs w:val="18"/>
-                <w:lang w:eastAsia="es-ES"/>
-              </w:rPr>
-              <w:t>request</w:t>
-            </w:r>
-            <w:proofErr w:type="spellEnd"/>
-            <w:r>
-              <w:rPr>
-                <w:rFonts w:ascii="Arial" w:eastAsia="Arial" w:hAnsi="Arial" w:cs="Arial"/>
-                <w:sz w:val="18"/>
-                <w:szCs w:val="18"/>
-                <w:lang w:eastAsia="es-ES"/>
-              </w:rPr>
-              <w:t>.</w:t>
+              <w:t>400 bad request.</w:t>
             </w:r>
           </w:p>
         </w:tc>
@@ -18613,27 +18328,7 @@
                 <w:szCs w:val="18"/>
                 <w:lang w:eastAsia="es-ES"/>
               </w:rPr>
-              <w:t xml:space="preserve">En la </w:t>
-            </w:r>
-            <w:proofErr w:type="spellStart"/>
-            <w:r>
-              <w:rPr>
-                <w:rFonts w:ascii="Arial" w:eastAsia="Arial" w:hAnsi="Arial" w:cs="Arial"/>
-                <w:sz w:val="18"/>
-                <w:szCs w:val="18"/>
-                <w:lang w:eastAsia="es-ES"/>
-              </w:rPr>
-              <w:t>gestion</w:t>
-            </w:r>
-            <w:proofErr w:type="spellEnd"/>
-            <w:r>
-              <w:rPr>
-                <w:rFonts w:ascii="Arial" w:eastAsia="Arial" w:hAnsi="Arial" w:cs="Arial"/>
-                <w:sz w:val="18"/>
-                <w:szCs w:val="18"/>
-                <w:lang w:eastAsia="es-ES"/>
-              </w:rPr>
-              <w:t xml:space="preserve"> de horarios se puede crear un horario para los cursos donde </w:t>
+              <w:t xml:space="preserve">En la gestion de horarios se puede crear un horario para los cursos donde </w:t>
             </w:r>
             <w:r>
               <w:rPr>
@@ -18651,19 +18346,8 @@
                 <w:szCs w:val="18"/>
                 <w:lang w:eastAsia="es-ES"/>
               </w:rPr>
-              <w:t xml:space="preserve">el </w:t>
-            </w:r>
-            <w:proofErr w:type="spellStart"/>
-            <w:r>
-              <w:rPr>
-                <w:rFonts w:ascii="Arial" w:eastAsia="Arial" w:hAnsi="Arial" w:cs="Arial"/>
-                <w:sz w:val="18"/>
-                <w:szCs w:val="18"/>
-                <w:lang w:eastAsia="es-ES"/>
-              </w:rPr>
-              <w:t>dia</w:t>
-            </w:r>
-            <w:proofErr w:type="spellEnd"/>
+              <w:t>el dia</w:t>
+            </w:r>
             <w:r>
               <w:rPr>
                 <w:rFonts w:ascii="Arial" w:eastAsia="Arial" w:hAnsi="Arial" w:cs="Arial"/>
@@ -18680,105 +18364,25 @@
                 <w:szCs w:val="18"/>
                 <w:lang w:eastAsia="es-ES"/>
               </w:rPr>
-              <w:t xml:space="preserve"> </w:t>
-            </w:r>
-            <w:proofErr w:type="spellStart"/>
-            <w:r>
-              <w:rPr>
-                <w:rFonts w:ascii="Arial" w:eastAsia="Arial" w:hAnsi="Arial" w:cs="Arial"/>
-                <w:sz w:val="18"/>
-                <w:szCs w:val="18"/>
-                <w:lang w:eastAsia="es-ES"/>
-              </w:rPr>
-              <w:t>despues</w:t>
-            </w:r>
-            <w:proofErr w:type="spellEnd"/>
-            <w:r>
-              <w:rPr>
-                <w:rFonts w:ascii="Arial" w:eastAsia="Arial" w:hAnsi="Arial" w:cs="Arial"/>
-                <w:sz w:val="18"/>
-                <w:szCs w:val="18"/>
-                <w:lang w:eastAsia="es-ES"/>
-              </w:rPr>
-              <w:t xml:space="preserve"> la materia, el maestro el cual solo mostrara los profesores que tengan disponibilidad </w:t>
-            </w:r>
-            <w:r>
-              <w:rPr>
-                <w:rFonts w:ascii="Arial" w:eastAsia="Arial" w:hAnsi="Arial" w:cs="Arial"/>
-                <w:sz w:val="18"/>
-                <w:szCs w:val="18"/>
-                <w:lang w:eastAsia="es-ES"/>
-              </w:rPr>
-              <w:t xml:space="preserve">en ese </w:t>
-            </w:r>
-            <w:proofErr w:type="spellStart"/>
-            <w:r>
-              <w:rPr>
-                <w:rFonts w:ascii="Arial" w:eastAsia="Arial" w:hAnsi="Arial" w:cs="Arial"/>
-                <w:sz w:val="18"/>
-                <w:szCs w:val="18"/>
-                <w:lang w:eastAsia="es-ES"/>
-              </w:rPr>
-              <w:t>dia</w:t>
-            </w:r>
-            <w:proofErr w:type="spellEnd"/>
-            <w:r>
-              <w:rPr>
-                <w:rFonts w:ascii="Arial" w:eastAsia="Arial" w:hAnsi="Arial" w:cs="Arial"/>
-                <w:sz w:val="18"/>
-                <w:szCs w:val="18"/>
-                <w:lang w:eastAsia="es-ES"/>
-              </w:rPr>
-              <w:t xml:space="preserve"> y que este asociado a esa materia, abajo del nombre aparece la disponibilidad del profesor que tenga ingresada.</w:t>
-            </w:r>
-            <w:r>
-              <w:rPr>
-                <w:rFonts w:ascii="Arial" w:eastAsia="Arial" w:hAnsi="Arial" w:cs="Arial"/>
-                <w:sz w:val="18"/>
-                <w:szCs w:val="18"/>
-                <w:lang w:eastAsia="es-ES"/>
-              </w:rPr>
-              <w:t xml:space="preserve"> Luego se coloca la hora en la que quiere ingresar el profesor, es decir, a las 6 de la mañana y eso </w:t>
-            </w:r>
-            <w:proofErr w:type="spellStart"/>
-            <w:r>
-              <w:rPr>
-                <w:rFonts w:ascii="Arial" w:eastAsia="Arial" w:hAnsi="Arial" w:cs="Arial"/>
-                <w:sz w:val="18"/>
-                <w:szCs w:val="18"/>
-                <w:lang w:eastAsia="es-ES"/>
-              </w:rPr>
-              <w:t>automaticamente</w:t>
-            </w:r>
-            <w:proofErr w:type="spellEnd"/>
-            <w:r>
-              <w:rPr>
-                <w:rFonts w:ascii="Arial" w:eastAsia="Arial" w:hAnsi="Arial" w:cs="Arial"/>
-                <w:sz w:val="18"/>
-                <w:szCs w:val="18"/>
-                <w:lang w:eastAsia="es-ES"/>
-              </w:rPr>
-              <w:t xml:space="preserve"> </w:t>
-            </w:r>
-            <w:proofErr w:type="spellStart"/>
-            <w:r>
-              <w:rPr>
-                <w:rFonts w:ascii="Arial" w:eastAsia="Arial" w:hAnsi="Arial" w:cs="Arial"/>
-                <w:sz w:val="18"/>
-                <w:szCs w:val="18"/>
-                <w:lang w:eastAsia="es-ES"/>
-              </w:rPr>
-              <w:t>hagarra</w:t>
-            </w:r>
-            <w:proofErr w:type="spellEnd"/>
-            <w:r>
-              <w:rPr>
-                <w:rFonts w:ascii="Arial" w:eastAsia="Arial" w:hAnsi="Arial" w:cs="Arial"/>
-                <w:sz w:val="18"/>
-                <w:szCs w:val="18"/>
-                <w:lang w:eastAsia="es-ES"/>
-              </w:rPr>
-              <w:t xml:space="preserve"> un lote de una hora es decir de 6 a 7 de la mañana</w:t>
+              <w:t xml:space="preserve"> despues la materia, el maestro el cual solo mostrara los profesores que tengan disponibilidad </w:t>
+            </w:r>
+            <w:r>
+              <w:rPr>
+                <w:rFonts w:ascii="Arial" w:eastAsia="Arial" w:hAnsi="Arial" w:cs="Arial"/>
+                <w:sz w:val="18"/>
+                <w:szCs w:val="18"/>
+                <w:lang w:eastAsia="es-ES"/>
+              </w:rPr>
+              <w:t>en ese dia y que este asociado a esa materia, abajo del nombre aparece la disponibilidad del profesor que tenga ingresada.</w:t>
+            </w:r>
+            <w:r>
+              <w:rPr>
+                <w:rFonts w:ascii="Arial" w:eastAsia="Arial" w:hAnsi="Arial" w:cs="Arial"/>
+                <w:sz w:val="18"/>
+                <w:szCs w:val="18"/>
+                <w:lang w:eastAsia="es-ES"/>
+              </w:rPr>
+              <w:t xml:space="preserve"> Luego se coloca la hora en la que quiere ingresar el profesor, es decir, a las 6 de la mañana y eso automaticamente hagarra un lote de una hora es decir de 6 a 7 de la mañana</w:t>
             </w:r>
             <w:r>
               <w:rPr>
@@ -18858,65 +18462,14 @@
                 <w:lang w:eastAsia="es-ES"/>
               </w:rPr>
             </w:pPr>
-            <w:proofErr w:type="spellStart"/>
-            <w:r>
-              <w:rPr>
-                <w:rFonts w:ascii="Arial" w:eastAsia="Arial" w:hAnsi="Arial" w:cs="Arial"/>
-                <w:sz w:val="18"/>
-                <w:szCs w:val="18"/>
-                <w:lang w:eastAsia="es-ES"/>
-              </w:rPr>
-              <w:t>Respond</w:t>
-            </w:r>
-            <w:proofErr w:type="spellEnd"/>
-            <w:r>
-              <w:rPr>
-                <w:rFonts w:ascii="Arial" w:eastAsia="Arial" w:hAnsi="Arial" w:cs="Arial"/>
-                <w:sz w:val="18"/>
-                <w:szCs w:val="18"/>
-                <w:lang w:eastAsia="es-ES"/>
-              </w:rPr>
-              <w:t xml:space="preserve"> 400 </w:t>
-            </w:r>
-            <w:proofErr w:type="spellStart"/>
-            <w:r>
-              <w:rPr>
-                <w:rFonts w:ascii="Arial" w:eastAsia="Arial" w:hAnsi="Arial" w:cs="Arial"/>
-                <w:sz w:val="18"/>
-                <w:szCs w:val="18"/>
-                <w:lang w:eastAsia="es-ES"/>
-              </w:rPr>
-              <w:t>bad</w:t>
-            </w:r>
-            <w:proofErr w:type="spellEnd"/>
-            <w:r>
-              <w:rPr>
-                <w:rFonts w:ascii="Arial" w:eastAsia="Arial" w:hAnsi="Arial" w:cs="Arial"/>
-                <w:sz w:val="18"/>
-                <w:szCs w:val="18"/>
-                <w:lang w:eastAsia="es-ES"/>
-              </w:rPr>
-              <w:t xml:space="preserve"> </w:t>
-            </w:r>
-            <w:proofErr w:type="spellStart"/>
-            <w:r>
-              <w:rPr>
-                <w:rFonts w:ascii="Arial" w:eastAsia="Arial" w:hAnsi="Arial" w:cs="Arial"/>
-                <w:sz w:val="18"/>
-                <w:szCs w:val="18"/>
-                <w:lang w:eastAsia="es-ES"/>
-              </w:rPr>
-              <w:t>request</w:t>
-            </w:r>
-            <w:proofErr w:type="spellEnd"/>
-            <w:r>
-              <w:rPr>
-                <w:rFonts w:ascii="Arial" w:eastAsia="Arial" w:hAnsi="Arial" w:cs="Arial"/>
-                <w:sz w:val="18"/>
-                <w:szCs w:val="18"/>
-                <w:lang w:eastAsia="es-ES"/>
-              </w:rPr>
-              <w:t>.</w:t>
+            <w:r>
+              <w:rPr>
+                <w:rFonts w:ascii="Arial" w:eastAsia="Arial" w:hAnsi="Arial" w:cs="Arial"/>
+                <w:sz w:val="18"/>
+                <w:szCs w:val="18"/>
+                <w:lang w:eastAsia="es-ES"/>
+              </w:rPr>
+              <w:t>Respond 400 bad request.</w:t>
             </w:r>
           </w:p>
         </w:tc>
@@ -19717,27 +19270,7 @@
                 <w:szCs w:val="18"/>
                 <w:lang w:eastAsia="es-ES"/>
               </w:rPr>
-              <w:t xml:space="preserve"> del </w:t>
-            </w:r>
-            <w:proofErr w:type="spellStart"/>
-            <w:r>
-              <w:rPr>
-                <w:rFonts w:ascii="Arial" w:eastAsia="Arial" w:hAnsi="Arial" w:cs="Arial"/>
-                <w:sz w:val="18"/>
-                <w:szCs w:val="18"/>
-                <w:lang w:eastAsia="es-ES"/>
-              </w:rPr>
-              <w:t>tokend</w:t>
-            </w:r>
-            <w:proofErr w:type="spellEnd"/>
-            <w:r>
-              <w:rPr>
-                <w:rFonts w:ascii="Arial" w:eastAsia="Arial" w:hAnsi="Arial" w:cs="Arial"/>
-                <w:sz w:val="18"/>
-                <w:szCs w:val="18"/>
-                <w:lang w:eastAsia="es-ES"/>
-              </w:rPr>
-              <w:t xml:space="preserve"> en funcionamiento</w:t>
+              <w:t xml:space="preserve"> del tokend en funcionamiento</w:t>
             </w:r>
           </w:p>
         </w:tc>
@@ -19842,47 +19375,7 @@
                 <w:szCs w:val="18"/>
                 <w:lang w:eastAsia="es-ES"/>
               </w:rPr>
-              <w:t xml:space="preserve">400 </w:t>
-            </w:r>
-            <w:proofErr w:type="spellStart"/>
-            <w:r>
-              <w:rPr>
-                <w:rFonts w:ascii="Arial" w:eastAsia="Arial" w:hAnsi="Arial" w:cs="Arial"/>
-                <w:sz w:val="18"/>
-                <w:szCs w:val="18"/>
-                <w:lang w:eastAsia="es-ES"/>
-              </w:rPr>
-              <w:t>bad</w:t>
-            </w:r>
-            <w:proofErr w:type="spellEnd"/>
-            <w:r>
-              <w:rPr>
-                <w:rFonts w:ascii="Arial" w:eastAsia="Arial" w:hAnsi="Arial" w:cs="Arial"/>
-                <w:sz w:val="18"/>
-                <w:szCs w:val="18"/>
-                <w:lang w:eastAsia="es-ES"/>
-              </w:rPr>
-              <w:t xml:space="preserve"> </w:t>
-            </w:r>
-            <w:proofErr w:type="spellStart"/>
-            <w:r>
-              <w:rPr>
-                <w:rFonts w:ascii="Arial" w:eastAsia="Arial" w:hAnsi="Arial" w:cs="Arial"/>
-                <w:sz w:val="18"/>
-                <w:szCs w:val="18"/>
-                <w:lang w:eastAsia="es-ES"/>
-              </w:rPr>
-              <w:t>request</w:t>
-            </w:r>
-            <w:proofErr w:type="spellEnd"/>
-            <w:r>
-              <w:rPr>
-                <w:rFonts w:ascii="Arial" w:eastAsia="Arial" w:hAnsi="Arial" w:cs="Arial"/>
-                <w:sz w:val="18"/>
-                <w:szCs w:val="18"/>
-                <w:lang w:eastAsia="es-ES"/>
-              </w:rPr>
-              <w:t xml:space="preserve"> (el token expiro o se eliminó y no se puede acceder al aplicativo)</w:t>
+              <w:t>400 bad request (el token expiro o se eliminó y no se puede acceder al aplicativo)</w:t>
             </w:r>
           </w:p>
         </w:tc>
@@ -20039,19 +19532,8 @@
                 <w:szCs w:val="18"/>
                 <w:lang w:eastAsia="es-ES"/>
               </w:rPr>
-              <w:t xml:space="preserve"> redirigido al apartado de </w:t>
-            </w:r>
-            <w:proofErr w:type="spellStart"/>
-            <w:r>
-              <w:rPr>
-                <w:rFonts w:ascii="Arial" w:eastAsia="Arial" w:hAnsi="Arial" w:cs="Arial"/>
-                <w:sz w:val="18"/>
-                <w:szCs w:val="18"/>
-                <w:lang w:eastAsia="es-ES"/>
-              </w:rPr>
-              <w:t>login</w:t>
-            </w:r>
-            <w:proofErr w:type="spellEnd"/>
+              <w:t xml:space="preserve"> redirigido al apartado de login</w:t>
+            </w:r>
             <w:r>
               <w:rPr>
                 <w:rFonts w:ascii="Arial" w:eastAsia="Arial" w:hAnsi="Arial" w:cs="Arial"/>
@@ -20189,65 +19671,14 @@
                 <w:lang w:eastAsia="es-ES"/>
               </w:rPr>
             </w:pPr>
-            <w:proofErr w:type="spellStart"/>
-            <w:r>
-              <w:rPr>
-                <w:rFonts w:ascii="Arial" w:eastAsia="Arial" w:hAnsi="Arial" w:cs="Arial"/>
-                <w:sz w:val="18"/>
-                <w:szCs w:val="18"/>
-                <w:lang w:eastAsia="es-ES"/>
-              </w:rPr>
-              <w:t>Respond</w:t>
-            </w:r>
-            <w:proofErr w:type="spellEnd"/>
-            <w:r>
-              <w:rPr>
-                <w:rFonts w:ascii="Arial" w:eastAsia="Arial" w:hAnsi="Arial" w:cs="Arial"/>
-                <w:sz w:val="18"/>
-                <w:szCs w:val="18"/>
-                <w:lang w:eastAsia="es-ES"/>
-              </w:rPr>
-              <w:t xml:space="preserve"> 400 </w:t>
-            </w:r>
-            <w:proofErr w:type="spellStart"/>
-            <w:r>
-              <w:rPr>
-                <w:rFonts w:ascii="Arial" w:eastAsia="Arial" w:hAnsi="Arial" w:cs="Arial"/>
-                <w:sz w:val="18"/>
-                <w:szCs w:val="18"/>
-                <w:lang w:eastAsia="es-ES"/>
-              </w:rPr>
-              <w:t>bad</w:t>
-            </w:r>
-            <w:proofErr w:type="spellEnd"/>
-            <w:r>
-              <w:rPr>
-                <w:rFonts w:ascii="Arial" w:eastAsia="Arial" w:hAnsi="Arial" w:cs="Arial"/>
-                <w:sz w:val="18"/>
-                <w:szCs w:val="18"/>
-                <w:lang w:eastAsia="es-ES"/>
-              </w:rPr>
-              <w:t xml:space="preserve"> </w:t>
-            </w:r>
-            <w:proofErr w:type="spellStart"/>
-            <w:r>
-              <w:rPr>
-                <w:rFonts w:ascii="Arial" w:eastAsia="Arial" w:hAnsi="Arial" w:cs="Arial"/>
-                <w:sz w:val="18"/>
-                <w:szCs w:val="18"/>
-                <w:lang w:eastAsia="es-ES"/>
-              </w:rPr>
-              <w:t>request</w:t>
-            </w:r>
-            <w:proofErr w:type="spellEnd"/>
-            <w:r>
-              <w:rPr>
-                <w:rFonts w:ascii="Arial" w:eastAsia="Arial" w:hAnsi="Arial" w:cs="Arial"/>
-                <w:sz w:val="18"/>
-                <w:szCs w:val="18"/>
-                <w:lang w:eastAsia="es-ES"/>
-              </w:rPr>
-              <w:t>.</w:t>
+            <w:r>
+              <w:rPr>
+                <w:rFonts w:ascii="Arial" w:eastAsia="Arial" w:hAnsi="Arial" w:cs="Arial"/>
+                <w:sz w:val="18"/>
+                <w:szCs w:val="18"/>
+                <w:lang w:eastAsia="es-ES"/>
+              </w:rPr>
+              <w:t>Respond 400 bad request.</w:t>
             </w:r>
           </w:p>
         </w:tc>
@@ -35177,12 +34608,7 @@
 </file>
 
 <file path=customXml/item2.xml><?xml version="1.0" encoding="utf-8"?>
-<?mso-contentType ?>
-<FormTemplates xmlns="http://schemas.microsoft.com/sharepoint/v3/contenttype/forms">
-  <Display>DocumentLibraryForm</Display>
-  <Edit>DocumentLibraryForm</Edit>
-  <New>DocumentLibraryForm</New>
-</FormTemplates>
+<b:Sources xmlns:b="http://schemas.openxmlformats.org/officeDocument/2006/bibliography" xmlns="http://schemas.openxmlformats.org/officeDocument/2006/bibliography" SelectedStyle="\APASixthEditionOfficeOnline.xsl" StyleName="APA" Version="6"/>
 </file>
 
 <file path=customXml/item3.xml><?xml version="1.0" encoding="utf-8"?>
@@ -35197,7 +34623,12 @@
 </file>
 
 <file path=customXml/item4.xml><?xml version="1.0" encoding="utf-8"?>
-<b:Sources xmlns:b="http://schemas.openxmlformats.org/officeDocument/2006/bibliography" xmlns="http://schemas.openxmlformats.org/officeDocument/2006/bibliography" SelectedStyle="\APASixthEditionOfficeOnline.xsl" StyleName="APA" Version="6"/>
+<?mso-contentType ?>
+<FormTemplates xmlns="http://schemas.microsoft.com/sharepoint/v3/contenttype/forms">
+  <Display>DocumentLibraryForm</Display>
+  <Edit>DocumentLibraryForm</Edit>
+  <New>DocumentLibraryForm</New>
+</FormTemplates>
 </file>
 
 <file path=customXml/itemProps1.xml><?xml version="1.0" encoding="utf-8"?>
@@ -35220,9 +34651,9 @@
 </file>
 
 <file path=customXml/itemProps2.xml><?xml version="1.0" encoding="utf-8"?>
-<ds:datastoreItem xmlns:ds="http://schemas.openxmlformats.org/officeDocument/2006/customXml" ds:itemID="{6134D922-5A9A-4435-9F2D-C21F098C03AB}">
+<ds:datastoreItem xmlns:ds="http://schemas.openxmlformats.org/officeDocument/2006/customXml" ds:itemID="{80EF5DC3-A1DE-4A72-A61C-4CFEA92FD7BF}">
   <ds:schemaRefs>
-    <ds:schemaRef ds:uri="http://schemas.microsoft.com/sharepoint/v3/contenttype/forms"/>
+    <ds:schemaRef ds:uri="http://schemas.openxmlformats.org/officeDocument/2006/bibliography"/>
   </ds:schemaRefs>
 </ds:datastoreItem>
 </file>
@@ -35239,9 +34670,9 @@
 </file>
 
 <file path=customXml/itemProps4.xml><?xml version="1.0" encoding="utf-8"?>
-<ds:datastoreItem xmlns:ds="http://schemas.openxmlformats.org/officeDocument/2006/customXml" ds:itemID="{80EF5DC3-A1DE-4A72-A61C-4CFEA92FD7BF}">
+<ds:datastoreItem xmlns:ds="http://schemas.openxmlformats.org/officeDocument/2006/customXml" ds:itemID="{6134D922-5A9A-4435-9F2D-C21F098C03AB}">
   <ds:schemaRefs>
-    <ds:schemaRef ds:uri="http://schemas.openxmlformats.org/officeDocument/2006/bibliography"/>
+    <ds:schemaRef ds:uri="http://schemas.microsoft.com/sharepoint/v3/contenttype/forms"/>
   </ds:schemaRefs>
 </ds:datastoreItem>
 </file>
</xml_diff>